<commit_message>
build_docx.py: drop links to other files, keep in-doc anchors
Confluence has no copy of the other repo docs, so their links become plain
text. The diagram is embedded by relative name instead of a temp path.

Co-Authored-By: Claude Opus 5.5 <noreply@anthropic.com>
Claude-Session: https://claude.ai/code/session_01GPXK7Bs1GehEH1fqF8ospt
</commit_message>
<xml_diff>
--- a/docs/print/operating-principles.docx
+++ b/docs/print/operating-principles.docx
@@ -2,7 +2,7 @@
 <file path=word/document.xml><?xml version="1.0" encoding="utf-8"?>
 <w:document xmlns:w="http://schemas.openxmlformats.org/wordprocessingml/2006/main" xmlns:m="http://schemas.openxmlformats.org/officeDocument/2006/math" xmlns:r="http://schemas.openxmlformats.org/officeDocument/2006/relationships" xmlns:o="urn:schemas-microsoft-com:office:office" xmlns:v="urn:schemas-microsoft-com:vml" xmlns:w10="urn:schemas-microsoft-com:office:word" xmlns:a="http://schemas.openxmlformats.org/drawingml/2006/main" xmlns:pic="http://schemas.openxmlformats.org/drawingml/2006/picture" xmlns:wp="http://schemas.openxmlformats.org/drawingml/2006/wordprocessingDrawing">
   <w:body>
-    <w:bookmarkStart w:id="48" w:name="X62640b4f8ce4f9ca7151157c4fb7bab4ea32221"/>
+    <w:bookmarkStart w:id="35" w:name="X62640b4f8ce4f9ca7151157c4fb7bab4ea32221"/>
     <w:p>
       <w:pPr>
         <w:pStyle w:val="Heading1"/>
@@ -753,7 +753,7 @@
               <a:graphicData uri="http://schemas.openxmlformats.org/drawingml/2006/picture">
                 <pic:pic>
                   <pic:nvPicPr>
-                    <pic:cNvPr descr="/var/folders/vx/j6t_57qj4k127v7g03d510gm0000gn/T/tmp37390ow3/diagram-1.png" id="11" name="Picture"/>
+                    <pic:cNvPr descr="diagram-1.png" id="11" name="Picture"/>
                     <pic:cNvPicPr>
                       <a:picLocks noChangeArrowheads="1" noChangeAspect="1"/>
                     </pic:cNvPicPr>
@@ -794,7 +794,7 @@
       </w:r>
     </w:p>
     <w:bookmarkEnd w:id="12"/>
-    <w:bookmarkStart w:id="21" w:name="a-capacity--what-we-can-promise"/>
+    <w:bookmarkStart w:id="16" w:name="a-capacity--what-we-can-promise"/>
     <w:p>
       <w:pPr>
         <w:pStyle w:val="Heading2"/>
@@ -815,7 +815,7 @@
         <w:t xml:space="preserve">Platform team owns. The guarantee in every other category depends on this one being right.</w:t>
       </w:r>
     </w:p>
-    <w:bookmarkStart w:id="17" w:name="a1-n1-node-failure-tolerance"/>
+    <w:bookmarkStart w:id="13" w:name="a1-n1-node-failure-tolerance"/>
     <w:p>
       <w:pPr>
         <w:pStyle w:val="Heading3"/>
@@ -883,32 +883,7 @@
         <w:t xml:space="preserve"> </w:t>
       </w:r>
       <w:r>
-        <w:t xml:space="preserve">(</w:t>
-      </w:r>
-      <w:hyperlink r:id="rId13">
-        <w:r>
-          <w:rPr>
-            <w:rStyle w:val="Hyperlink"/>
-          </w:rPr>
-          <w:t xml:space="preserve">allocation model</w:t>
-        </w:r>
-      </w:hyperlink>
-      <w:r>
-        <w:t xml:space="preserve">,</w:t>
-      </w:r>
-      <w:r>
-        <w:t xml:space="preserve"> </w:t>
-      </w:r>
-      <w:hyperlink r:id="rId14">
-        <w:r>
-          <w:rPr>
-            <w:rStyle w:val="Hyperlink"/>
-          </w:rPr>
-          <w:t xml:space="preserve">planner guide</w:t>
-        </w:r>
-      </w:hyperlink>
-      <w:r>
-        <w:t xml:space="preserve">).</w:t>
+        <w:t xml:space="preserve">(allocation model, planner guide).</w:t>
       </w:r>
     </w:p>
     <w:p>
@@ -1084,32 +1059,7 @@
         <w:t xml:space="preserve"> </w:t>
       </w:r>
       <w:r>
-        <w:t xml:space="preserve">(</w:t>
-      </w:r>
-      <w:hyperlink r:id="rId15">
-        <w:r>
-          <w:rPr>
-            <w:rStyle w:val="Hyperlink"/>
-          </w:rPr>
-          <w:t xml:space="preserve">process</w:t>
-        </w:r>
-      </w:hyperlink>
-      <w:r>
-        <w:t xml:space="preserve">, action D5 in</w:t>
-      </w:r>
-      <w:r>
-        <w:t xml:space="preserve"> </w:t>
-      </w:r>
-      <w:hyperlink r:id="rId16">
-        <w:r>
-          <w:rPr>
-            <w:rStyle w:val="Hyperlink"/>
-          </w:rPr>
-          <w:t xml:space="preserve">07</w:t>
-        </w:r>
-      </w:hyperlink>
-      <w:r>
-        <w:t xml:space="preserve">).</w:t>
+        <w:t xml:space="preserve">(process, action D5 in 07).</w:t>
       </w:r>
     </w:p>
     <w:p>
@@ -1148,8 +1098,8 @@
         <w:t xml:space="preserve">).</w:t>
       </w:r>
     </w:p>
-    <w:bookmarkEnd w:id="17"/>
-    <w:bookmarkStart w:id="19" w:name="a2-conservative-allocation"/>
+    <w:bookmarkEnd w:id="13"/>
+    <w:bookmarkStart w:id="14" w:name="a2-conservative-allocation"/>
     <w:p>
       <w:pPr>
         <w:pStyle w:val="Heading3"/>
@@ -1335,18 +1285,7 @@
         <w:t xml:space="preserve"> </w:t>
       </w:r>
       <w:r>
-        <w:t xml:space="preserve">for new hardware (</w:t>
-      </w:r>
-      <w:hyperlink r:id="rId18">
-        <w:r>
-          <w:rPr>
-            <w:rStyle w:val="Hyperlink"/>
-          </w:rPr>
-          <w:t xml:space="preserve">emergency increase</w:t>
-        </w:r>
-      </w:hyperlink>
-      <w:r>
-        <w:t xml:space="preserve">).</w:t>
+        <w:t xml:space="preserve">for new hardware (emergency increase).</w:t>
       </w:r>
     </w:p>
     <w:p>
@@ -1415,8 +1354,8 @@
         <w:t xml:space="preserve">skipped HA). Say no to capacity we don't have, not to capacity that is justified.</w:t>
       </w:r>
     </w:p>
-    <w:bookmarkEnd w:id="19"/>
-    <w:bookmarkStart w:id="20" w:name="a3-autoscaling-and-bursts"/>
+    <w:bookmarkEnd w:id="14"/>
+    <w:bookmarkStart w:id="15" w:name="a3-autoscaling-and-bursts"/>
     <w:p>
       <w:pPr>
         <w:pStyle w:val="Heading3"/>
@@ -1573,9 +1512,9 @@
         </w:pict>
       </w:r>
     </w:p>
-    <w:bookmarkEnd w:id="20"/>
-    <w:bookmarkEnd w:id="21"/>
-    <w:bookmarkStart w:id="29" w:name="b-tenancy--how-we-share-it"/>
+    <w:bookmarkEnd w:id="15"/>
+    <w:bookmarkEnd w:id="16"/>
+    <w:bookmarkStart w:id="20" w:name="b-tenancy--how-we-share-it"/>
     <w:p>
       <w:pPr>
         <w:pStyle w:val="Heading2"/>
@@ -1596,7 +1535,7 @@
         <w:t xml:space="preserve">Platform team sets the rules and enforces them; tenants can't opt out.</w:t>
       </w:r>
     </w:p>
-    <w:bookmarkStart w:id="25" w:name="b1-fairness-between-tenants"/>
+    <w:bookmarkStart w:id="17" w:name="b1-fairness-between-tenants"/>
     <w:p>
       <w:pPr>
         <w:pStyle w:val="Heading3"/>
@@ -1636,18 +1575,7 @@
         <w:t xml:space="preserve"> </w:t>
       </w:r>
       <w:r>
-        <w:t xml:space="preserve">the project splits it over its namespaces itself (</w:t>
-      </w:r>
-      <w:hyperlink r:id="rId22">
-        <w:r>
-          <w:rPr>
-            <w:rStyle w:val="Hyperlink"/>
-          </w:rPr>
-          <w:t xml:space="preserve">allocation model</w:t>
-        </w:r>
-      </w:hyperlink>
-      <w:r>
-        <w:t xml:space="preserve">).</w:t>
+        <w:t xml:space="preserve">the project splits it over its namespaces itself (allocation model).</w:t>
       </w:r>
     </w:p>
     <w:p>
@@ -1765,21 +1693,7 @@
         <w:t xml:space="preserve"> </w:t>
       </w:r>
       <w:r>
-        <w:t xml:space="preserve">time. Using idle CPU above requests is allowed (no CPU limits,</w:t>
-      </w:r>
-      <w:r>
-        <w:t xml:space="preserve"> </w:t>
-      </w:r>
-      <w:hyperlink r:id="rId23">
-        <w:r>
-          <w:rPr>
-            <w:rStyle w:val="Hyperlink"/>
-          </w:rPr>
-          <w:t xml:space="preserve">ADR-0003</w:t>
-        </w:r>
-      </w:hyperlink>
-      <w:r>
-        <w:t xml:space="preserve">) and never takes</w:t>
+        <w:t xml:space="preserve">time. Using idle CPU above requests is allowed (no CPU limits, ADR-0003) and never takes</w:t>
       </w:r>
       <w:r>
         <w:t xml:space="preserve"> </w:t>
@@ -1933,22 +1847,11 @@
         <w:t xml:space="preserve"> </w:t>
       </w:r>
       <w:r>
-        <w:t xml:space="preserve">showback compares projects on the same basis (</w:t>
-      </w:r>
-      <w:hyperlink r:id="rId24">
-        <w:r>
-          <w:rPr>
-            <w:rStyle w:val="Hyperlink"/>
-          </w:rPr>
-          <w:t xml:space="preserve">ADR-0002</w:t>
-        </w:r>
-      </w:hyperlink>
-      <w:r>
-        <w:t xml:space="preserve">).</w:t>
-      </w:r>
-    </w:p>
-    <w:bookmarkEnd w:id="25"/>
-    <w:bookmarkStart w:id="26" w:name="b2-priority-and-preemption"/>
+        <w:t xml:space="preserve">showback compares projects on the same basis (ADR-0002).</w:t>
+      </w:r>
+    </w:p>
+    <w:bookmarkEnd w:id="17"/>
+    <w:bookmarkStart w:id="18" w:name="b2-priority-and-preemption"/>
     <w:p>
       <w:pPr>
         <w:pStyle w:val="Heading3"/>
@@ -2136,8 +2039,8 @@
         <w:t xml:space="preserve">In mixed clusters (prod + non-prod on the same nodes, Q2), non-prod runs at lower priority.</w:t>
       </w:r>
     </w:p>
-    <w:bookmarkEnd w:id="26"/>
-    <w:bookmarkStart w:id="28" w:name="b3-isolation-beyond-cpu-and-memory"/>
+    <w:bookmarkEnd w:id="18"/>
+    <w:bookmarkStart w:id="19" w:name="b3-isolation-beyond-cpu-and-memory"/>
     <w:p>
       <w:pPr>
         <w:pStyle w:val="Heading3"/>
@@ -2281,18 +2184,7 @@
         <w:t xml:space="preserve"> </w:t>
       </w:r>
       <w:r>
-        <w:t xml:space="preserve">(</w:t>
-      </w:r>
-      <w:hyperlink r:id="rId27">
-        <w:r>
-          <w:rPr>
-            <w:rStyle w:val="Hyperlink"/>
-          </w:rPr>
-          <w:t xml:space="preserve">allocation model</w:t>
-        </w:r>
-      </w:hyperlink>
-      <w:r>
-        <w:t xml:space="preserve">).</w:t>
+        <w:t xml:space="preserve">(allocation model).</w:t>
       </w:r>
     </w:p>
     <w:p>
@@ -2404,9 +2296,9 @@
         </w:pict>
       </w:r>
     </w:p>
-    <w:bookmarkEnd w:id="28"/>
-    <w:bookmarkEnd w:id="29"/>
-    <w:bookmarkStart w:id="34" w:name="X608d1944dc049a4d6f9890dbeafb69d83703bbc"/>
+    <w:bookmarkEnd w:id="19"/>
+    <w:bookmarkEnd w:id="20"/>
+    <w:bookmarkStart w:id="24" w:name="X608d1944dc049a4d6f9890dbeafb69d83703bbc"/>
     <w:p>
       <w:pPr>
         <w:pStyle w:val="Heading2"/>
@@ -2441,7 +2333,7 @@
         <w:t xml:space="preserve">doesn't follow them doesn't get the guarantees of A and B.</w:t>
       </w:r>
     </w:p>
-    <w:bookmarkStart w:id="31" w:name="c1-requests-vs-limits-req--lmt"/>
+    <w:bookmarkStart w:id="21" w:name="c1-requests-vs-limits-req--lmt"/>
     <w:p>
       <w:pPr>
         <w:pStyle w:val="Heading3"/>
@@ -2478,21 +2370,7 @@
         </w:numPr>
       </w:pPr>
       <w:r>
-        <w:t xml:space="preserve">Requests must be set on every container, including sidecars and init containers (</w:t>
-      </w:r>
-      <w:hyperlink r:id="rId30">
-        <w:r>
-          <w:rPr>
-            <w:rStyle w:val="Hyperlink"/>
-          </w:rPr>
-          <w:t xml:space="preserve">standards</w:t>
-        </w:r>
-      </w:hyperlink>
-      <w:r>
-        <w:t xml:space="preserve"> </w:t>
-      </w:r>
-      <w:r>
-        <w:t xml:space="preserve">S1, S8).</w:t>
+        <w:t xml:space="preserve">Requests must be set on every container, including sidecars and init containers (standards S1, S8).</w:t>
       </w:r>
     </w:p>
     <w:p>
@@ -2592,18 +2470,7 @@
         <w:t xml:space="preserve">CPU: limits optional</w:t>
       </w:r>
       <w:r>
-        <w:t xml:space="preserve">, ≥ 2× request if set (</w:t>
-      </w:r>
-      <w:hyperlink r:id="rId23">
-        <w:r>
-          <w:rPr>
-            <w:rStyle w:val="Hyperlink"/>
-          </w:rPr>
-          <w:t xml:space="preserve">ADR-0003</w:t>
-        </w:r>
-      </w:hyperlink>
-      <w:r>
-        <w:t xml:space="preserve">). req &lt; lmt on CPU is safe: CPU is</w:t>
+        <w:t xml:space="preserve">, ≥ 2× request if set (ADR-0003). req &lt; lmt on CPU is safe: CPU is</w:t>
       </w:r>
       <w:r>
         <w:t xml:space="preserve"> </w:t>
@@ -2776,8 +2643,8 @@
         <w:t xml:space="preserve">can enforce the memory ratio per environment.</w:t>
       </w:r>
     </w:p>
-    <w:bookmarkEnd w:id="31"/>
-    <w:bookmarkStart w:id="32" w:name="c2-replicas"/>
+    <w:bookmarkEnd w:id="21"/>
+    <w:bookmarkStart w:id="22" w:name="c2-replicas"/>
     <w:p>
       <w:pPr>
         <w:pStyle w:val="Heading3"/>
@@ -2953,18 +2820,7 @@
         <w:t xml:space="preserve"> </w:t>
       </w:r>
       <w:r>
-        <w:t xml:space="preserve">for large pods (</w:t>
-      </w:r>
-      <w:hyperlink r:id="rId13">
-        <w:r>
-          <w:rPr>
-            <w:rStyle w:val="Hyperlink"/>
-          </w:rPr>
-          <w:t xml:space="preserve">allocation model</w:t>
-        </w:r>
-      </w:hyperlink>
-      <w:r>
-        <w:t xml:space="preserve">).</w:t>
+        <w:t xml:space="preserve">for large pods (allocation model).</w:t>
       </w:r>
     </w:p>
     <w:p>
@@ -3023,8 +2879,8 @@
         <w:t xml:space="preserve">Non-prod: 1 replica is fine unless the environment is used to test HA behaviour (acc).</w:t>
       </w:r>
     </w:p>
-    <w:bookmarkEnd w:id="32"/>
-    <w:bookmarkStart w:id="33" w:name="c3-workload-ha"/>
+    <w:bookmarkEnd w:id="22"/>
+    <w:bookmarkStart w:id="23" w:name="c3-workload-ha"/>
     <w:p>
       <w:pPr>
         <w:pStyle w:val="Heading3"/>
@@ -3374,9 +3230,9 @@
         </w:pict>
       </w:r>
     </w:p>
-    <w:bookmarkEnd w:id="33"/>
-    <w:bookmarkEnd w:id="34"/>
-    <w:bookmarkStart w:id="36" w:name="d-platform-reliability--what-we-run"/>
+    <w:bookmarkEnd w:id="23"/>
+    <w:bookmarkEnd w:id="24"/>
+    <w:bookmarkStart w:id="26" w:name="d-platform-reliability--what-we-run"/>
     <w:p>
       <w:pPr>
         <w:pStyle w:val="Heading2"/>
@@ -3397,7 +3253,7 @@
         <w:t xml:space="preserve">Platform team owns end to end. Tenants' HA is only as good as the platform underneath.</w:t>
       </w:r>
     </w:p>
-    <w:bookmarkStart w:id="35" w:name="d1-platform-ha"/>
+    <w:bookmarkStart w:id="25" w:name="d1-platform-ha"/>
     <w:p>
       <w:pPr>
         <w:pStyle w:val="Heading3"/>
@@ -3630,9 +3486,9 @@
         </w:pict>
       </w:r>
     </w:p>
-    <w:bookmarkEnd w:id="35"/>
-    <w:bookmarkEnd w:id="36"/>
-    <w:bookmarkStart w:id="42" w:name="Xfdbe14c2c1e1aff58901759e9b961ae8db6bb6b"/>
+    <w:bookmarkEnd w:id="25"/>
+    <w:bookmarkEnd w:id="26"/>
+    <w:bookmarkStart w:id="30" w:name="Xfdbe14c2c1e1aff58901759e9b961ae8db6bb6b"/>
     <w:p>
       <w:pPr>
         <w:pStyle w:val="Heading2"/>
@@ -3653,7 +3509,7 @@
         <w:t xml:space="preserve">Platform team runs it; teams take part in reviews and fix what's theirs.</w:t>
       </w:r>
     </w:p>
-    <w:bookmarkStart w:id="37" w:name="e1-maintenance"/>
+    <w:bookmarkStart w:id="27" w:name="e1-maintenance"/>
     <w:p>
       <w:pPr>
         <w:pStyle w:val="Heading3"/>
@@ -3812,8 +3668,8 @@
         <w:t xml:space="preserve">and offboarding.</w:t>
       </w:r>
     </w:p>
-    <w:bookmarkEnd w:id="37"/>
-    <w:bookmarkStart w:id="38" w:name="e2-monitoring-and-alerts"/>
+    <w:bookmarkEnd w:id="27"/>
+    <w:bookmarkStart w:id="28" w:name="e2-monitoring-and-alerts"/>
     <w:p>
       <w:pPr>
         <w:pStyle w:val="Heading3"/>
@@ -3839,21 +3695,7 @@
         </w:numPr>
       </w:pPr>
       <w:r>
-        <w:t xml:space="preserve">N+1 breached on a cluster (D5 in</w:t>
-      </w:r>
-      <w:r>
-        <w:t xml:space="preserve"> </w:t>
-      </w:r>
-      <w:hyperlink r:id="rId16">
-        <w:r>
-          <w:rPr>
-            <w:rStyle w:val="Hyperlink"/>
-          </w:rPr>
-          <w:t xml:space="preserve">07</w:t>
-        </w:r>
-      </w:hyperlink>
-      <w:r>
-        <w:t xml:space="preserve">).</w:t>
+        <w:t xml:space="preserve">N+1 breached on a cluster (D5 in 07).</w:t>
       </w:r>
     </w:p>
     <w:p>
@@ -3931,8 +3773,8 @@
         <w:t xml:space="preserve">or under memory/disk pressure.</w:t>
       </w:r>
     </w:p>
-    <w:bookmarkEnd w:id="38"/>
-    <w:bookmarkStart w:id="41" w:name="e3-reviews-and-changes"/>
+    <w:bookmarkEnd w:id="28"/>
+    <w:bookmarkStart w:id="29" w:name="e3-reviews-and-changes"/>
     <w:p>
       <w:pPr>
         <w:pStyle w:val="Heading3"/>
@@ -3963,18 +3805,7 @@
         <w:t xml:space="preserve"> </w:t>
       </w:r>
       <w:r>
-        <w:t xml:space="preserve">(quota vs. requests vs. usage), reclaim or right-size (</w:t>
-      </w:r>
-      <w:hyperlink r:id="rId39">
-        <w:r>
-          <w:rPr>
-            <w:rStyle w:val="Hyperlink"/>
-          </w:rPr>
-          <w:t xml:space="preserve">process</w:t>
-        </w:r>
-      </w:hyperlink>
-      <w:r>
-        <w:t xml:space="preserve">).</w:t>
+        <w:t xml:space="preserve">(quota vs. requests vs. usage), reclaim or right-size (process).</w:t>
       </w:r>
     </w:p>
     <w:p>
@@ -3996,18 +3827,7 @@
         <w:t xml:space="preserve"> </w:t>
       </w:r>
       <w:r>
-        <w:t xml:space="preserve">go through Git and review, like any other change (</w:t>
-      </w:r>
-      <w:hyperlink r:id="rId40">
-        <w:r>
-          <w:rPr>
-            <w:rStyle w:val="Hyperlink"/>
-          </w:rPr>
-          <w:t xml:space="preserve">ADR-0001</w:t>
-        </w:r>
-      </w:hyperlink>
-      <w:r>
-        <w:t xml:space="preserve">);</w:t>
+        <w:t xml:space="preserve">go through Git and review, like any other change (ADR-0001);</w:t>
       </w:r>
       <w:r>
         <w:t xml:space="preserve"> </w:t>
@@ -4067,9 +3887,9 @@
         </w:pict>
       </w:r>
     </w:p>
-    <w:bookmarkEnd w:id="41"/>
-    <w:bookmarkEnd w:id="42"/>
-    <w:bookmarkStart w:id="47" w:name="f-finance--what-it-costs"/>
+    <w:bookmarkEnd w:id="29"/>
+    <w:bookmarkEnd w:id="30"/>
+    <w:bookmarkStart w:id="34" w:name="f-finance--what-it-costs"/>
     <w:p>
       <w:pPr>
         <w:pStyle w:val="Heading2"/>
@@ -4090,7 +3910,7 @@
         <w:t xml:space="preserve">Platform team owns the cost model and publishes the rates; finance approves them; projects pay from their budget.</w:t>
       </w:r>
     </w:p>
-    <w:bookmarkStart w:id="44" w:name="f1-cost-model-and-unit-rates"/>
+    <w:bookmarkStart w:id="31" w:name="f1-cost-model-and-unit-rates"/>
     <w:p>
       <w:pPr>
         <w:pStyle w:val="Heading3"/>
@@ -4274,18 +4094,7 @@
         <w:t xml:space="preserve">Projects pay for allocated quota</w:t>
       </w:r>
       <w:r>
-        <w:t xml:space="preserve">, not for usage (</w:t>
-      </w:r>
-      <w:hyperlink r:id="rId24">
-        <w:r>
-          <w:rPr>
-            <w:rStyle w:val="Hyperlink"/>
-          </w:rPr>
-          <w:t xml:space="preserve">ADR-0002</w:t>
-        </w:r>
-      </w:hyperlink>
-      <w:r>
-        <w:t xml:space="preserve">): budgets stay predictable, and giving back unused</w:t>
+        <w:t xml:space="preserve">, not for usage (ADR-0002): budgets stay predictable, and giving back unused</w:t>
       </w:r>
       <w:r>
         <w:t xml:space="preserve"> </w:t>
@@ -4341,18 +4150,7 @@
         </w:numPr>
       </w:pPr>
       <w:r>
-        <w:t xml:space="preserve">Shared and platform services are part of the rate unless finance decides to fund them separately (</w:t>
-      </w:r>
-      <w:hyperlink r:id="rId43">
-        <w:r>
-          <w:rPr>
-            <w:rStyle w:val="Hyperlink"/>
-          </w:rPr>
-          <w:t xml:space="preserve">Q12</w:t>
-        </w:r>
-      </w:hyperlink>
-      <w:r>
-        <w:t xml:space="preserve">).</w:t>
+        <w:t xml:space="preserve">Shared and platform services are part of the rate unless finance decides to fund them separately (Q12).</w:t>
       </w:r>
     </w:p>
     <w:p>
@@ -4367,8 +4165,8 @@
         <w:t xml:space="preserve">Unspent budget is fine; unused quota is not: it blocks capacity that others pay for.</w:t>
       </w:r>
     </w:p>
-    <w:bookmarkEnd w:id="44"/>
-    <w:bookmarkStart w:id="45" w:name="f2-rancher-licence-cpu-cores"/>
+    <w:bookmarkEnd w:id="31"/>
+    <w:bookmarkStart w:id="32" w:name="f2-rancher-licence-cpu-cores"/>
     <w:p>
       <w:pPr>
         <w:pStyle w:val="Heading3"/>
@@ -4515,22 +4313,11 @@
         </w:numPr>
       </w:pPr>
       <w:r>
-        <w:t xml:space="preserve">To confirm in the contract: physical cores or threads, and whether control plane / etcd nodes count (</w:t>
-      </w:r>
-      <w:hyperlink r:id="rId43">
-        <w:r>
-          <w:rPr>
-            <w:rStyle w:val="Hyperlink"/>
-          </w:rPr>
-          <w:t xml:space="preserve">Q16</w:t>
-        </w:r>
-      </w:hyperlink>
-      <w:r>
-        <w:t xml:space="preserve">).</w:t>
-      </w:r>
-    </w:p>
-    <w:bookmarkEnd w:id="45"/>
-    <w:bookmarkStart w:id="46" w:name="X91ca963c339be69ea88cdf46d5570d58a21aba0"/>
+        <w:t xml:space="preserve">To confirm in the contract: physical cores or threads, and whether control plane / etcd nodes count (Q16).</w:t>
+      </w:r>
+    </w:p>
+    <w:bookmarkEnd w:id="32"/>
+    <w:bookmarkStart w:id="33" w:name="X91ca963c339be69ea88cdf46d5570d58a21aba0"/>
     <w:p>
       <w:pPr>
         <w:pStyle w:val="Heading3"/>
@@ -4805,9 +4592,9 @@
         <w:t xml:space="preserve">when the next approved quota would take the cluster above 80 % or turn N+1 red.</w:t>
       </w:r>
     </w:p>
-    <w:bookmarkEnd w:id="46"/>
-    <w:bookmarkEnd w:id="47"/>
-    <w:bookmarkEnd w:id="48"/>
+    <w:bookmarkEnd w:id="33"/>
+    <w:bookmarkEnd w:id="34"/>
+    <w:bookmarkEnd w:id="35"/>
     <w:sectPr>
       <w:footnotePr>
         <w:numRestart w:val="eachSect"/>

</xml_diff>